<commit_message>
Added the Spanish limited scope language and DOCX to the package
</commit_message>
<xml_diff>
--- a/docassemble/USCISApplications/data/templates/Court_Accompaniment_limited_scope.docx
+++ b/docassemble/USCISApplications/data/templates/Court_Accompaniment_limited_scope.docx
@@ -213,8 +213,9 @@
           <w:sz w:val="22"/>
           <w:szCs w:val="22"/>
         </w:rPr>
-        <w:t>We need to learn some details about individual cases in order to prepare participants</w:t>
-      </w:r>
+        <w:t xml:space="preserve">We need to learn some details about individual cases </w:t>
+      </w:r>
+      <w:proofErr w:type="gramStart"/>
       <w:r>
         <w:rPr>
           <w:rStyle w:val="normaltextrun"/>
@@ -222,7 +223,66 @@
           <w:sz w:val="22"/>
           <w:szCs w:val="22"/>
         </w:rPr>
-        <w:t xml:space="preserve"> for their Immigration Court hearings. During the legal orientation, participants are responsible for giving accurate,  truthful information. All the information provided to the workshop  during this time will remain confidential with the exceptions noted below.</w:t>
+        <w:t>in order to</w:t>
+      </w:r>
+      <w:proofErr w:type="gramEnd"/>
+      <w:r>
+        <w:rPr>
+          <w:rStyle w:val="normaltextrun"/>
+          <w:rFonts w:ascii="Calibri" w:eastAsia="Calibri" w:hAnsi="Calibri" w:cs="Calibri"/>
+          <w:sz w:val="22"/>
+          <w:szCs w:val="22"/>
+        </w:rPr>
+        <w:t xml:space="preserve"> prepare participants</w:t>
+      </w:r>
+      <w:r>
+        <w:rPr>
+          <w:rStyle w:val="normaltextrun"/>
+          <w:rFonts w:ascii="Calibri" w:eastAsia="Calibri" w:hAnsi="Calibri" w:cs="Calibri"/>
+          <w:sz w:val="22"/>
+          <w:szCs w:val="22"/>
+        </w:rPr>
+        <w:t xml:space="preserve"> for their Immigration Court hearings. During the legal orientation, participants are responsible for giving </w:t>
+      </w:r>
+      <w:proofErr w:type="gramStart"/>
+      <w:r>
+        <w:rPr>
+          <w:rStyle w:val="normaltextrun"/>
+          <w:rFonts w:ascii="Calibri" w:eastAsia="Calibri" w:hAnsi="Calibri" w:cs="Calibri"/>
+          <w:sz w:val="22"/>
+          <w:szCs w:val="22"/>
+        </w:rPr>
+        <w:t>accurate,  truthful</w:t>
+      </w:r>
+      <w:proofErr w:type="gramEnd"/>
+      <w:r>
+        <w:rPr>
+          <w:rStyle w:val="normaltextrun"/>
+          <w:rFonts w:ascii="Calibri" w:eastAsia="Calibri" w:hAnsi="Calibri" w:cs="Calibri"/>
+          <w:sz w:val="22"/>
+          <w:szCs w:val="22"/>
+        </w:rPr>
+        <w:t xml:space="preserve"> information. All the information provided to the </w:t>
+      </w:r>
+      <w:proofErr w:type="gramStart"/>
+      <w:r>
+        <w:rPr>
+          <w:rStyle w:val="normaltextrun"/>
+          <w:rFonts w:ascii="Calibri" w:eastAsia="Calibri" w:hAnsi="Calibri" w:cs="Calibri"/>
+          <w:sz w:val="22"/>
+          <w:szCs w:val="22"/>
+        </w:rPr>
+        <w:t>workshop  during</w:t>
+      </w:r>
+      <w:proofErr w:type="gramEnd"/>
+      <w:r>
+        <w:rPr>
+          <w:rStyle w:val="normaltextrun"/>
+          <w:rFonts w:ascii="Calibri" w:eastAsia="Calibri" w:hAnsi="Calibri" w:cs="Calibri"/>
+          <w:sz w:val="22"/>
+          <w:szCs w:val="22"/>
+        </w:rPr>
+        <w:t xml:space="preserve"> this time will remain confidential with the exceptions noted below.</w:t>
       </w:r>
       <w:r>
         <w:rPr>
@@ -377,6 +437,7 @@
           <w:szCs w:val="22"/>
         </w:rPr>
       </w:pPr>
+      <w:proofErr w:type="gramStart"/>
       <w:r>
         <w:rPr>
           <w:rFonts w:ascii="Calibri" w:hAnsi="Calibri" w:cs="Calibri"/>
@@ -392,7 +453,16 @@
           <w:sz w:val="22"/>
           <w:szCs w:val="22"/>
         </w:rPr>
-        <w:t>output_checkbox</w:t>
+        <w:t>output</w:t>
+      </w:r>
+      <w:proofErr w:type="gramEnd"/>
+      <w:r>
+        <w:rPr>
+          <w:rFonts w:ascii="Calibri" w:hAnsi="Calibri" w:cs="Calibri"/>
+          <w:sz w:val="22"/>
+          <w:szCs w:val="22"/>
+        </w:rPr>
+        <w:t>_checkbox</w:t>
       </w:r>
       <w:proofErr w:type="spellEnd"/>
       <w:r>
@@ -456,6 +526,7 @@
           <w:szCs w:val="22"/>
         </w:rPr>
       </w:pPr>
+      <w:proofErr w:type="gramStart"/>
       <w:r>
         <w:rPr>
           <w:rFonts w:ascii="Calibri" w:hAnsi="Calibri" w:cs="Calibri"/>
@@ -471,7 +542,16 @@
           <w:sz w:val="22"/>
           <w:szCs w:val="22"/>
         </w:rPr>
-        <w:t>output_checkbox</w:t>
+        <w:t>output</w:t>
+      </w:r>
+      <w:proofErr w:type="gramEnd"/>
+      <w:r>
+        <w:rPr>
+          <w:rFonts w:ascii="Calibri" w:hAnsi="Calibri" w:cs="Calibri"/>
+          <w:sz w:val="22"/>
+          <w:szCs w:val="22"/>
+        </w:rPr>
+        <w:t>_checkbox</w:t>
       </w:r>
       <w:proofErr w:type="spellEnd"/>
       <w:r>
@@ -551,6 +631,7 @@
           <w:szCs w:val="22"/>
         </w:rPr>
       </w:pPr>
+      <w:proofErr w:type="gramStart"/>
       <w:r>
         <w:rPr>
           <w:rFonts w:ascii="Calibri" w:hAnsi="Calibri" w:cs="Calibri"/>
@@ -566,7 +647,16 @@
           <w:sz w:val="22"/>
           <w:szCs w:val="22"/>
         </w:rPr>
-        <w:t>output_checkbox</w:t>
+        <w:t>output</w:t>
+      </w:r>
+      <w:proofErr w:type="gramEnd"/>
+      <w:r>
+        <w:rPr>
+          <w:rFonts w:ascii="Calibri" w:hAnsi="Calibri" w:cs="Calibri"/>
+          <w:sz w:val="22"/>
+          <w:szCs w:val="22"/>
+        </w:rPr>
+        <w:t>_checkbox</w:t>
       </w:r>
       <w:proofErr w:type="spellEnd"/>
       <w:r>
@@ -622,6 +712,7 @@
           <w:szCs w:val="22"/>
         </w:rPr>
       </w:pPr>
+      <w:proofErr w:type="gramStart"/>
       <w:r>
         <w:rPr>
           <w:rFonts w:ascii="Calibri" w:hAnsi="Calibri" w:cs="Calibri"/>
@@ -637,7 +728,16 @@
           <w:sz w:val="22"/>
           <w:szCs w:val="22"/>
         </w:rPr>
-        <w:t>output_checkbox</w:t>
+        <w:t>output</w:t>
+      </w:r>
+      <w:proofErr w:type="gramEnd"/>
+      <w:r>
+        <w:rPr>
+          <w:rFonts w:ascii="Calibri" w:hAnsi="Calibri" w:cs="Calibri"/>
+          <w:sz w:val="22"/>
+          <w:szCs w:val="22"/>
+        </w:rPr>
+        <w:t>_checkbox</w:t>
       </w:r>
       <w:proofErr w:type="spellEnd"/>
       <w:r>
@@ -830,6 +930,7 @@
         </w:rPr>
         <w:t xml:space="preserve"> </w:t>
       </w:r>
+      <w:proofErr w:type="gramStart"/>
       <w:r>
         <w:rPr>
           <w:rFonts w:asciiTheme="majorHAnsi" w:hAnsiTheme="majorHAnsi" w:cstheme="majorHAnsi"/>
@@ -848,6 +949,7 @@
         <w:t>users</w:t>
       </w:r>
       <w:proofErr w:type="spellEnd"/>
+      <w:proofErr w:type="gramEnd"/>
       <w:r>
         <w:rPr>
           <w:rFonts w:asciiTheme="majorHAnsi" w:hAnsiTheme="majorHAnsi" w:cstheme="majorHAnsi"/>
@@ -939,6 +1041,7 @@
                 <w:lang w:val="es-419"/>
               </w:rPr>
             </w:pPr>
+            <w:proofErr w:type="gramStart"/>
             <w:r>
               <w:rPr>
                 <w:color w:val="000000" w:themeColor="text1"/>
@@ -949,7 +1052,14 @@
               <w:rPr>
                 <w:color w:val="000000" w:themeColor="text1"/>
               </w:rPr>
-              <w:t>users[0]</w:t>
+              <w:t>users</w:t>
+            </w:r>
+            <w:proofErr w:type="gramEnd"/>
+            <w:r>
+              <w:rPr>
+                <w:color w:val="000000" w:themeColor="text1"/>
+              </w:rPr>
+              <w:t>[0]</w:t>
             </w:r>
             <w:r>
               <w:rPr>
@@ -990,11 +1100,19 @@
                 <w:lang w:val="es-419"/>
               </w:rPr>
             </w:pPr>
+            <w:proofErr w:type="gramStart"/>
             <w:r>
               <w:rPr>
                 <w:rFonts w:asciiTheme="majorHAnsi" w:hAnsiTheme="majorHAnsi" w:cstheme="majorHAnsi"/>
               </w:rPr>
-              <w:t>{{ today() }}</w:t>
+              <w:t>{{ today</w:t>
+            </w:r>
+            <w:proofErr w:type="gramEnd"/>
+            <w:r>
+              <w:rPr>
+                <w:rFonts w:asciiTheme="majorHAnsi" w:hAnsiTheme="majorHAnsi" w:cstheme="majorHAnsi"/>
+              </w:rPr>
+              <w:t>() }}</w:t>
             </w:r>
           </w:p>
         </w:tc>
@@ -1114,6 +1232,7 @@
     </w:tbl>
     <w:p>
       <w:pPr>
+        <w:spacing w:after="0"/>
         <w:rPr>
           <w:rFonts w:ascii="Calibri" w:hAnsi="Calibri" w:cs="Calibri"/>
           <w:sz w:val="22"/>
@@ -4599,12 +4718,14 @@
 </file>
 
 <file path=customXml/item1.xml><?xml version="1.0" encoding="utf-8"?>
-<?mso-contentType ?>
-<FormTemplates xmlns="http://schemas.microsoft.com/sharepoint/v3/contenttype/forms">
-  <Display>DocumentLibraryForm</Display>
-  <Edit>DocumentLibraryForm</Edit>
-  <New>DocumentLibraryForm</New>
-</FormTemplates>
+<p:properties xmlns:p="http://schemas.microsoft.com/office/2006/metadata/properties" xmlns:xsi="http://www.w3.org/2001/XMLSchema-instance" xmlns:pc="http://schemas.microsoft.com/office/infopath/2007/PartnerControls">
+  <documentManagement>
+    <TaxCatchAll xmlns="63cf8f5e-9a9d-4cda-a6f1-06d9c3ed1b56" xsi:nil="true"/>
+    <lcf76f155ced4ddcb4097134ff3c332f xmlns="80f56af5-a235-4a30-ba2c-31a6d000d72b">
+      <Terms xmlns="http://schemas.microsoft.com/office/infopath/2007/PartnerControls"/>
+    </lcf76f155ced4ddcb4097134ff3c332f>
+  </documentManagement>
+</p:properties>
 </file>
 
 <file path=customXml/item2.xml><?xml version="1.0" encoding="utf-8"?>
@@ -4809,20 +4930,21 @@
 </file>
 
 <file path=customXml/item3.xml><?xml version="1.0" encoding="utf-8"?>
-<p:properties xmlns:p="http://schemas.microsoft.com/office/2006/metadata/properties" xmlns:xsi="http://www.w3.org/2001/XMLSchema-instance" xmlns:pc="http://schemas.microsoft.com/office/infopath/2007/PartnerControls">
-  <documentManagement>
-    <TaxCatchAll xmlns="63cf8f5e-9a9d-4cda-a6f1-06d9c3ed1b56" xsi:nil="true"/>
-    <lcf76f155ced4ddcb4097134ff3c332f xmlns="80f56af5-a235-4a30-ba2c-31a6d000d72b">
-      <Terms xmlns="http://schemas.microsoft.com/office/infopath/2007/PartnerControls"/>
-    </lcf76f155ced4ddcb4097134ff3c332f>
-  </documentManagement>
-</p:properties>
+<?mso-contentType ?>
+<FormTemplates xmlns="http://schemas.microsoft.com/sharepoint/v3/contenttype/forms">
+  <Display>DocumentLibraryForm</Display>
+  <Edit>DocumentLibraryForm</Edit>
+  <New>DocumentLibraryForm</New>
+</FormTemplates>
 </file>
 
 <file path=customXml/itemProps1.xml><?xml version="1.0" encoding="utf-8"?>
-<ds:datastoreItem xmlns:ds="http://schemas.openxmlformats.org/officeDocument/2006/customXml" ds:itemID="{B3360DED-8045-43BC-A3F1-77FB7861BCDC}">
+<ds:datastoreItem xmlns:ds="http://schemas.openxmlformats.org/officeDocument/2006/customXml" ds:itemID="{8C707276-E6C9-40A6-AF54-110DDA88B001}">
   <ds:schemaRefs>
-    <ds:schemaRef ds:uri="http://schemas.microsoft.com/sharepoint/v3/contenttype/forms"/>
+    <ds:schemaRef ds:uri="http://schemas.microsoft.com/office/2006/metadata/properties"/>
+    <ds:schemaRef ds:uri="http://schemas.microsoft.com/office/infopath/2007/PartnerControls"/>
+    <ds:schemaRef ds:uri="63cf8f5e-9a9d-4cda-a6f1-06d9c3ed1b56"/>
+    <ds:schemaRef ds:uri="80f56af5-a235-4a30-ba2c-31a6d000d72b"/>
   </ds:schemaRefs>
 </ds:datastoreItem>
 </file>
@@ -4847,12 +4969,9 @@
 </file>
 
 <file path=customXml/itemProps3.xml><?xml version="1.0" encoding="utf-8"?>
-<ds:datastoreItem xmlns:ds="http://schemas.openxmlformats.org/officeDocument/2006/customXml" ds:itemID="{8C707276-E6C9-40A6-AF54-110DDA88B001}">
+<ds:datastoreItem xmlns:ds="http://schemas.openxmlformats.org/officeDocument/2006/customXml" ds:itemID="{B3360DED-8045-43BC-A3F1-77FB7861BCDC}">
   <ds:schemaRefs>
-    <ds:schemaRef ds:uri="http://schemas.microsoft.com/office/2006/metadata/properties"/>
-    <ds:schemaRef ds:uri="http://schemas.microsoft.com/office/infopath/2007/PartnerControls"/>
-    <ds:schemaRef ds:uri="63cf8f5e-9a9d-4cda-a6f1-06d9c3ed1b56"/>
-    <ds:schemaRef ds:uri="80f56af5-a235-4a30-ba2c-31a6d000d72b"/>
+    <ds:schemaRef ds:uri="http://schemas.microsoft.com/sharepoint/v3/contenttype/forms"/>
   </ds:schemaRefs>
 </ds:datastoreItem>
 </file>
</xml_diff>